<commit_message>
Fase 14: imágenes de los productos y supuesto S-03 de la ERS actualizado
</commit_message>
<xml_diff>
--- a/docs/ERS-V2.docx
+++ b/docs/ERS-V2.docx
@@ -1120,7 +1120,19 @@
         <w:t xml:space="preserve"> </w:t>
       </w:r>
       <w:r>
-        <w:t xml:space="preserve">Las imágenes de productos son provisionales (un marcador genérico) hasta que se cargue el material gráfico definitivo.</w:t>
+        <w:t xml:space="preserve">Los 8 productos iniciales tienen una imagen propia guardada en</w:t>
+      </w:r>
+      <w:r>
+        <w:t xml:space="preserve"> </w:t>
+      </w:r>
+      <w:r>
+        <w:rPr>
+          <w:rStyle w:val="VerbatimChar"/>
+        </w:rPr>
+        <w:t xml:space="preserve">public/img/</w:t>
+      </w:r>
+      <w:r>
+        <w:t xml:space="preserve">. Los productos que se crean desde el panel usan una imagen genérica, porque el sistema no incluye carga de imágenes.</w:t>
       </w:r>
     </w:p>
     <w:bookmarkEnd w:id="28"/>
@@ -8456,6 +8468,56 @@
             </w:r>
             <w:r>
               <w:t xml:space="preserve">. Sin cambios de funcionalidad.</w:t>
+            </w:r>
+          </w:p>
+        </w:tc>
+        <w:tc>
+          <w:tcPr/>
+          <w:p>
+            <w:pPr>
+              <w:pStyle w:val="Compact"/>
+              <w:jc w:val="left"/>
+            </w:pPr>
+            <w:r>
+              <w:t xml:space="preserve">Vicente Mendoza</w:t>
+            </w:r>
+          </w:p>
+        </w:tc>
+      </w:tr>
+      <w:tr>
+        <w:tc>
+          <w:tcPr/>
+          <w:p>
+            <w:pPr>
+              <w:pStyle w:val="Compact"/>
+              <w:jc w:val="left"/>
+            </w:pPr>
+            <w:r>
+              <w:t xml:space="preserve">2.2</w:t>
+            </w:r>
+          </w:p>
+        </w:tc>
+        <w:tc>
+          <w:tcPr/>
+          <w:p>
+            <w:pPr>
+              <w:pStyle w:val="Compact"/>
+              <w:jc w:val="left"/>
+            </w:pPr>
+            <w:r>
+              <w:t xml:space="preserve">Octubre 2026</w:t>
+            </w:r>
+          </w:p>
+        </w:tc>
+        <w:tc>
+          <w:tcPr/>
+          <w:p>
+            <w:pPr>
+              <w:pStyle w:val="Compact"/>
+              <w:jc w:val="left"/>
+            </w:pPr>
+            <w:r>
+              <w:t xml:space="preserve">Se agregan imágenes a los 8 productos iniciales y se actualiza el supuesto S-03. Sin cambios de lógica.</w:t>
             </w:r>
           </w:p>
         </w:tc>

</xml_diff>